<commit_message>
Final deployment readiness and verified A-DMFE build
</commit_message>
<xml_diff>
--- a/paper/v2_MasterBased/AI-Powered_Unified_Mobility_8page.docx
+++ b/paper/v2_MasterBased/AI-Powered_Unified_Mobility_8page.docx
@@ -3797,7 +3797,7 @@
     </w:p>
     <w:bookmarkEnd w:id="30"/>
     <w:bookmarkEnd w:id="31"/>
-    <w:bookmarkStart w:id="100" w:name="sec:method"/>
+    <w:bookmarkStart w:id="101" w:name="sec:method"/>
     <w:p>
       <w:pPr>
         <w:pStyle w:val="Heading1"/>
@@ -7687,6 +7687,156 @@
         <w:t xml:space="preserve">described in Sections III-B to III-D.</w:t>
       </w:r>
     </w:p>
+    <w:bookmarkEnd w:id="99"/>
+    <w:bookmarkStart w:id="100" w:name="provenance-of-the-formulation"/>
+    <w:p>
+      <w:pPr>
+        <w:pStyle w:val="Heading2"/>
+      </w:pPr>
+      <w:r>
+        <w:t xml:space="preserve">Provenance of the Formulation</w:t>
+      </w:r>
+    </w:p>
+    <w:p>
+      <w:pPr>
+        <w:pStyle w:val="FirstParagraph"/>
+      </w:pPr>
+      <w:r>
+        <w:t xml:space="preserve">Because the framework assembles standard mathematical constructions alongside</w:t>
+      </w:r>
+      <w:r>
+        <w:t xml:space="preserve"> </w:t>
+      </w:r>
+      <w:r>
+        <w:t xml:space="preserve">relations specific to this work, it is worth stating plainly which is which.</w:t>
+      </w:r>
+      <w:r>
+        <w:t xml:space="preserve"> </w:t>
+      </w:r>
+      <w:r>
+        <w:t xml:space="preserve">Equations (2), (3), (10), (12) and (13) are particular to this paper: the</w:t>
+      </w:r>
+      <w:r>
+        <w:t xml:space="preserve"> </w:t>
+      </w:r>
+      <w:r>
+        <w:t xml:space="preserve">five-criterion compatibility score and its admission rule, the boundedness</w:t>
+      </w:r>
+      <w:r>
+        <w:t xml:space="preserve"> </w:t>
+      </w:r>
+      <w:r>
+        <w:t xml:space="preserve">result, the fail-closed bound of Proposition 1, and the complexity</w:t>
+      </w:r>
+      <w:r>
+        <w:t xml:space="preserve"> </w:t>
+      </w:r>
+      <w:r>
+        <w:t xml:space="preserve">statement under a bounded candidate neighbourhood. The remainder instantiate</w:t>
+      </w:r>
+      <w:r>
+        <w:t xml:space="preserve"> </w:t>
+      </w:r>
+      <w:r>
+        <w:t xml:space="preserve">established forms rather than introduce new mathematics. Equations (4)</w:t>
+      </w:r>
+      <w:r>
+        <w:t xml:space="preserve"> </w:t>
+      </w:r>
+      <w:r>
+        <w:t xml:space="preserve">and (6) are normalised-difference similarity kernels, with the service-type</w:t>
+      </w:r>
+      <w:r>
+        <w:t xml:space="preserve"> </w:t>
+      </w:r>
+      <w:r>
+        <w:t xml:space="preserve">tolerance W_type the element contributed here; (5) is the capacity</w:t>
+      </w:r>
+      <w:r>
+        <w:t xml:space="preserve"> </w:t>
+      </w:r>
+      <w:r>
+        <w:t xml:space="preserve">indicator conventional in capacitated vehicle routing; (7) and (8) are</w:t>
+      </w:r>
+      <w:r>
+        <w:t xml:space="preserve"> </w:t>
+      </w:r>
+      <w:r>
+        <w:t xml:space="preserve">weighted-sum scalarisations of the routing and assignment objectives in the</w:t>
+      </w:r>
+      <w:r>
+        <w:t xml:space="preserve"> </w:t>
+      </w:r>
+      <w:r>
+        <w:t xml:space="preserve">form usual for pickup-and-delivery problems with time windows; and (14) is the</w:t>
+      </w:r>
+      <w:r>
+        <w:t xml:space="preserve"> </w:t>
+      </w:r>
+      <w:r>
+        <w:t xml:space="preserve">classical linear assignment problem, solved by the Hungarian</w:t>
+      </w:r>
+      <w:r>
+        <w:t xml:space="preserve"> </w:t>
+      </w:r>
+      <w:r>
+        <w:t xml:space="preserve">method [12]. Equations (15), (16), (18) and (19) are respectively</w:t>
+      </w:r>
+      <w:r>
+        <w:t xml:space="preserve"> </w:t>
+      </w:r>
+      <w:r>
+        <w:t xml:space="preserve">the softmax parameterisation, the binary cross-entropy loss, the softmax</w:t>
+      </w:r>
+      <w:r>
+        <w:t xml:space="preserve"> </w:t>
+      </w:r>
+      <w:r>
+        <w:t xml:space="preserve">Jacobian, and the stochastic-gradient update—all standard in machine</w:t>
+      </w:r>
+      <w:r>
+        <w:t xml:space="preserve"> </w:t>
+      </w:r>
+      <w:r>
+        <w:t xml:space="preserve">learning, applied here to the weight vector α—while (20) expresses</w:t>
+      </w:r>
+      <w:r>
+        <w:t xml:space="preserve"> </w:t>
+      </w:r>
+      <w:r>
+        <w:t xml:space="preserve">the expected utility of a decision threshold in the usual</w:t>
+      </w:r>
+      <w:r>
+        <w:t xml:space="preserve"> </w:t>
+      </w:r>
+      <w:r>
+        <w:t xml:space="preserve">receiver-operating-characteristic form. Equation (1) is an evaluation device</w:t>
+      </w:r>
+      <w:r>
+        <w:t xml:space="preserve"> </w:t>
+      </w:r>
+      <w:r>
+        <w:t xml:space="preserve">defined in this paper for Table I and is not claimed as a</w:t>
+      </w:r>
+      <w:r>
+        <w:t xml:space="preserve"> </w:t>
+      </w:r>
+      <w:r>
+        <w:t xml:space="preserve">contribution. The novelty therefore lies not in the individual constructions</w:t>
+      </w:r>
+      <w:r>
+        <w:t xml:space="preserve"> </w:t>
+      </w:r>
+      <w:r>
+        <w:t xml:space="preserve">but in their composition into a feasibility-first layer spanning three service</w:t>
+      </w:r>
+      <w:r>
+        <w:t xml:space="preserve"> </w:t>
+      </w:r>
+      <w:r>
+        <w:t xml:space="preserve">types, and in the properties established in Section III-D.</w:t>
+      </w:r>
+    </w:p>
     <w:p>
       <w:pPr>
         <w:jc w:val="left"/>
@@ -7870,9 +8020,9 @@
         <w:t xml:space="preserve">14  every N completions: tau* &lt;- argmax_tau E[U(tau)]        (20)</w:t>
       </w:r>
     </w:p>
-    <w:bookmarkEnd w:id="99"/>
     <w:bookmarkEnd w:id="100"/>
-    <w:bookmarkStart w:id="105" w:name="experimental-setup"/>
+    <w:bookmarkEnd w:id="101"/>
+    <w:bookmarkStart w:id="106" w:name="experimental-setup"/>
     <w:p>
       <w:pPr>
         <w:pStyle w:val="Heading1"/>
@@ -7881,7 +8031,7 @@
         <w:t xml:space="preserve">Experimental Setup</w:t>
       </w:r>
     </w:p>
-    <w:bookmarkStart w:id="101" w:name="test-environment"/>
+    <w:bookmarkStart w:id="102" w:name="test-environment"/>
     <w:p>
       <w:pPr>
         <w:pStyle w:val="Heading2"/>
@@ -7928,8 +8078,8 @@
         <w:t xml:space="preserve">type, matching the shared schema of Section III.</w:t>
       </w:r>
     </w:p>
-    <w:bookmarkEnd w:id="101"/>
-    <w:bookmarkStart w:id="102" w:name="baseline"/>
+    <w:bookmarkEnd w:id="102"/>
+    <w:bookmarkStart w:id="103" w:name="baseline"/>
     <w:p>
       <w:pPr>
         <w:pStyle w:val="Heading2"/>
@@ -7970,8 +8120,8 @@
         <w:t xml:space="preserve">batching is applied.</w:t>
       </w:r>
     </w:p>
-    <w:bookmarkEnd w:id="102"/>
-    <w:bookmarkStart w:id="104" w:name="evaluation-metrics"/>
+    <w:bookmarkEnd w:id="103"/>
+    <w:bookmarkStart w:id="105" w:name="evaluation-metrics"/>
     <w:p>
       <w:pPr>
         <w:pStyle w:val="Heading2"/>
@@ -8012,7 +8162,7 @@
         <w:t xml:space="preserve">service-level quality for any individual request.</w:t>
       </w:r>
     </w:p>
-    <w:bookmarkStart w:id="103" w:name="tab:metrics"/>
+    <w:bookmarkStart w:id="104" w:name="tab:metrics"/>
     <w:p>
       <w:pPr>
         <w:pStyle w:val="TableCaption"/>
@@ -8203,10 +8353,10 @@
         </w:tc>
       </w:tr>
     </w:tbl>
-    <w:bookmarkEnd w:id="103"/>
     <w:bookmarkEnd w:id="104"/>
     <w:bookmarkEnd w:id="105"/>
-    <w:bookmarkStart w:id="117" w:name="sec:results"/>
+    <w:bookmarkEnd w:id="106"/>
+    <w:bookmarkStart w:id="118" w:name="sec:results"/>
     <w:p>
       <w:pPr>
         <w:pStyle w:val="Heading1"/>
@@ -8215,7 +8365,7 @@
         <w:t xml:space="preserve">Results and Discussion</w:t>
       </w:r>
     </w:p>
-    <w:bookmarkStart w:id="106" w:name="pilot-deployment"/>
+    <w:bookmarkStart w:id="107" w:name="pilot-deployment"/>
     <w:p>
       <w:pPr>
         <w:pStyle w:val="Heading2"/>
@@ -8304,8 +8454,8 @@
         <w:t xml:space="preserve">Section VI, and a larger trial is the intended next step.</w:t>
       </w:r>
     </w:p>
-    <w:bookmarkEnd w:id="106"/>
-    <w:bookmarkStart w:id="110" w:name="compatibility-score-distribution"/>
+    <w:bookmarkEnd w:id="107"/>
+    <w:bookmarkStart w:id="111" w:name="compatibility-score-distribution"/>
     <w:p>
       <w:pPr>
         <w:pStyle w:val="Heading2"/>
@@ -8409,18 +8559,18 @@
           <wp:inline>
             <wp:extent cx="5334000" cy="3536022"/>
             <wp:effectExtent b="0" l="0" r="0" t="0"/>
-            <wp:docPr descr="" title="" id="108" name="Picture"/>
+            <wp:docPr descr="" title="" id="109" name="Picture"/>
             <a:graphic>
               <a:graphicData uri="http://schemas.openxmlformats.org/drawingml/2006/picture">
                 <pic:pic>
                   <pic:nvPicPr>
-                    <pic:cNvPr descr="fig_compat_orig.png" id="109" name="Picture"/>
+                    <pic:cNvPr descr="fig_compat_orig.png" id="110" name="Picture"/>
                     <pic:cNvPicPr>
                       <a:picLocks noChangeArrowheads="1" noChangeAspect="1"/>
                     </pic:cNvPicPr>
                   </pic:nvPicPr>
                   <pic:blipFill>
-                    <a:blip r:embed="rId107"/>
+                    <a:blip r:embed="rId108"/>
                     <a:stretch>
                       <a:fillRect/>
                     </a:stretch>
@@ -8461,8 +8611,8 @@
         <w:t xml:space="preserve">pairs.</w:t>
       </w:r>
     </w:p>
-    <w:bookmarkEnd w:id="110"/>
-    <w:bookmarkStart w:id="114" w:name="Xcd63f61cc7cb3085bdb98c7a8ef9ca8719a6b52"/>
+    <w:bookmarkEnd w:id="111"/>
+    <w:bookmarkStart w:id="115" w:name="Xcd63f61cc7cb3085bdb98c7a8ef9ca8719a6b52"/>
     <w:p>
       <w:pPr>
         <w:pStyle w:val="Heading2"/>
@@ -8545,18 +8695,18 @@
           <wp:inline>
             <wp:extent cx="5334000" cy="3151909"/>
             <wp:effectExtent b="0" l="0" r="0" t="0"/>
-            <wp:docPr descr="" title="" id="112" name="Picture"/>
+            <wp:docPr descr="" title="" id="113" name="Picture"/>
             <a:graphic>
               <a:graphicData uri="http://schemas.openxmlformats.org/drawingml/2006/picture">
                 <pic:pic>
                   <pic:nvPicPr>
-                    <pic:cNvPr descr="fig_perf_orig.png" id="113" name="Picture"/>
+                    <pic:cNvPr descr="fig_perf_orig.png" id="114" name="Picture"/>
                     <pic:cNvPicPr>
                       <a:picLocks noChangeArrowheads="1" noChangeAspect="1"/>
                     </pic:cNvPicPr>
                   </pic:nvPicPr>
                   <pic:blipFill>
-                    <a:blip r:embed="rId111"/>
+                    <a:blip r:embed="rId112"/>
                     <a:stretch>
                       <a:fillRect/>
                     </a:stretch>
@@ -8689,8 +8839,8 @@
         <w:t xml:space="preserve">across the same window.</w:t>
       </w:r>
     </w:p>
-    <w:bookmarkEnd w:id="114"/>
-    <w:bookmarkStart w:id="115" w:name="comparative-discussion"/>
+    <w:bookmarkEnd w:id="115"/>
+    <w:bookmarkStart w:id="116" w:name="comparative-discussion"/>
     <w:p>
       <w:pPr>
         <w:pStyle w:val="Heading2"/>
@@ -8847,8 +8997,8 @@
         <w:t xml:space="preserve">uniform across metrics.</w:t>
       </w:r>
     </w:p>
-    <w:bookmarkEnd w:id="115"/>
-    <w:bookmarkStart w:id="116" w:name="interpretation-and-caveats"/>
+    <w:bookmarkEnd w:id="116"/>
+    <w:bookmarkStart w:id="117" w:name="interpretation-and-caveats"/>
     <w:p>
       <w:pPr>
         <w:pStyle w:val="Heading2"/>
@@ -8949,9 +9099,9 @@
         <w:t xml:space="preserve">completed-trip outcomes than this pilot generated.</w:t>
       </w:r>
     </w:p>
-    <w:bookmarkEnd w:id="116"/>
     <w:bookmarkEnd w:id="117"/>
-    <w:bookmarkStart w:id="118" w:name="sec:limits"/>
+    <w:bookmarkEnd w:id="118"/>
+    <w:bookmarkStart w:id="119" w:name="sec:limits"/>
     <w:p>
       <w:pPr>
         <w:pStyle w:val="Heading1"/>
@@ -9156,8 +9306,8 @@
         <w:t xml:space="preserve">optimal-policy reference such a learner would have to match.</w:t>
       </w:r>
     </w:p>
-    <w:bookmarkEnd w:id="118"/>
-    <w:bookmarkStart w:id="119" w:name="conclusion"/>
+    <w:bookmarkEnd w:id="119"/>
+    <w:bookmarkStart w:id="120" w:name="conclusion"/>
     <w:p>
       <w:pPr>
         <w:pStyle w:val="Heading1"/>
@@ -9258,8 +9408,8 @@
         <w:t xml:space="preserve">completed-trip outcomes.</w:t>
       </w:r>
     </w:p>
-    <w:bookmarkEnd w:id="119"/>
-    <w:bookmarkStart w:id="121" w:name="references"/>
+    <w:bookmarkEnd w:id="120"/>
+    <w:bookmarkStart w:id="122" w:name="references"/>
     <w:p>
       <w:pPr>
         <w:pStyle w:val="Heading1"/>
@@ -9633,7 +9783,7 @@
       <w:r>
         <w:t xml:space="preserve"> </w:t>
       </w:r>
-      <w:hyperlink r:id="rId120">
+      <w:hyperlink r:id="rId121">
         <w:r>
           <w:rPr>
             <w:rStyle w:val="Hyperlink"/>
@@ -9675,7 +9825,7 @@
         <w:t xml:space="preserve">, vol. 2, no. 1–2, pp. 83–97, 1955, doi: 10.1002/nav.3800020109.</w:t>
       </w:r>
     </w:p>
-    <w:bookmarkEnd w:id="121"/>
+    <w:bookmarkEnd w:id="122"/>
     <w:sectPr/>
     <w:sectPr>
       <w:pgSz w:w="12240" w:h="15840"/>

</xml_diff>